<commit_message>
auto: XHS cards — 2026-08-02
</commit_message>
<xml_diff>
--- a/docs/xhs/2026-08-01/历史故事/发布文案.docx
+++ b/docs/xhs/2026-08-01/历史故事/发布文案.docx
@@ -11,7 +11,7 @@
         <w:rPr>
           <w:color w:val="CC3333"/>
         </w:rPr>
-        <w:t>所有历史迷！把这10个典故焊脑子里！</w:t>
+        <w:t>历史课本不会告诉你的10个真相</w:t>
       </w:r>
     </w:p>
     <w:p>
@@ -40,25 +40,25 @@
         <w:spacing w:line="384" w:lineRule="auto"/>
       </w:pPr>
       <w:r>
-        <w:t>庖丁解牛可不是普通宰牛，刀法自带BGM，筋骨分离声如古琴韵律，梁惠王当场看呆。更绝的是他花了19年把解牛练成“道”，刀用了19年还像新磨的🔪</w:t>
+        <w:t>王羲之写个木板，墨迹渗进去三分深，工匠削都削不掉，这哪是写字，分明是刻进了DNA！🔥 他愣是把一池清水写成墨汁，走路时在衣服上比划，衣襟全磨烂——原来大佬的日常，是拿自己当宣纸练。</w:t>
         <w:br/>
         <w:br/>
-        <w:t>纪昌更卷，学射箭先练两年不眨眼，又花三年把虱子盯成车轮大，一箭穿心。极致基本功就是最高级的开挂，现在还有人焦虑速成吗？🤯</w:t>
+        <w:t>项羽更绝，带兵过河直接把锅砸了、船沉了，每人揣三天干粮就去跟几十万秦军拼命。不留退路的楚军，硬是九战九胜，最后各路诸侯跪着进来拜见。⚔️ 人有时候不是不行，是后路太多。</w:t>
         <w:br/>
         <w:br/>
-        <w:t>唾面自干这个典故才叫真·情绪管理。唐朝宰相对弟弟说：别人吐你脸上，擦掉反而激怒对方，不如笑着等它风干。这格局，简直是古代反内耗指南🧘</w:t>
+        <w:t>还有廉颇，听说蔺相如为了国家处处躲他，这位老将当场脱了上衣，背着荆条上门请罪。做错就认，挨打站稳，将军的体面在格局面前不值一提。🤯</w:t>
         <w:br/>
         <w:br/>
-        <w:t>曲突徙薪的故事最扎心。客人建议把烟囱改弯，主家不听，失火后只感谢救火的人，却忘了最初提醒的人。防患于未然永远是最硬核的智慧，可惜人性总爱事后补救🔥</w:t>
+        <w:t>这些故事都指向同一件事：极致的人，从来不给自己留缝隙。王羲之把字写进木板，项羽把生路放进战场，越王勾践睡柴堆舔苦胆二十年，愣是把耻辱活成燃料。📖</w:t>
         <w:br/>
         <w:br/>
-        <w:t>老马识途是妥妥的经验碾压，百万买房千万买邻教你看透圈层价值，终军请缨19岁自荐出使南越，深入虎穴以命换邦交。这些故事里藏着认知阶层的密码⚔️</w:t>
+        <w:t>最让我起鸡皮疙瘩的是庖丁解牛——一把刀用了十九年还像新的，因为他的刀刃永远在骨缝里游走。看清规律，远比蛮干高级。💡</w:t>
         <w:br/>
         <w:br/>
-        <w:t>金句：阅历才是降维打击，极致重复就是天赋，真正的成熟从不怕被吐唾沫开始。</w:t>
+        <w:t>记住，所有你看到的一战成名，都是长年累月的入木三分。</w:t>
         <w:br/>
         <w:br/>
-        <w:t>哪条让你瞬间开悟？或者你觉得自己最需要修炼哪种古代超能力？评论区见👇</w:t>
+        <w:t>你最想把哪个故事焊进脑子？评论区聊聊，我挨个翻牌～</w:t>
       </w:r>
     </w:p>
     <w:p>
@@ -91,7 +91,7 @@
           <w:b/>
           <w:sz w:val="32"/>
         </w:rPr>
-        <w:t>看完我跪了</w:t>
+        <w:t>古人卷疯了</w:t>
       </w:r>
     </w:p>
     <w:p>
@@ -110,7 +110,7 @@
         <w:rPr>
           <w:sz w:val="24"/>
         </w:rPr>
-        <w:t>#1  春秋 · 老马识途  [成语典故]</w:t>
+        <w:t>#1  东晋 · 入木三分  [成语典故]</w:t>
       </w:r>
     </w:p>
     <w:p>
@@ -118,7 +118,7 @@
         <w:spacing w:line="336" w:lineRule="auto"/>
       </w:pPr>
       <w:r>
-        <w:t>💡 有经验的老马能识途，提醒我们应尊重经验，善于运用已有的智慧，不可轻视长者或过往的积累。</w:t>
+        <w:t>💡 极致功夫来自极致专注与持久练习。无论书法还是其他技艺，当热爱变成习惯，便能在无人注意的细节里铸就非凡深度。</w:t>
       </w:r>
     </w:p>
     <w:p/>
@@ -130,7 +130,7 @@
         <w:rPr>
           <w:sz w:val="24"/>
         </w:rPr>
-        <w:t>#2  西汉 · 曲突徙薪  [成语典故]</w:t>
+        <w:t>#2  秦末 · 破釜沉舟  [成语典故]</w:t>
       </w:r>
     </w:p>
     <w:p>
@@ -138,7 +138,7 @@
         <w:spacing w:line="336" w:lineRule="auto"/>
       </w:pPr>
       <w:r>
-        <w:t>💡 防患于未然最为关键，事后补救的价值远不如事前预防，要重视有远见的警告。</w:t>
+        <w:t>💡 切断后路常常能激发最大潜能。生活中有些抉择需要不留退路的勇气，全力以赴才能绝处逢生。</w:t>
       </w:r>
     </w:p>
     <w:p/>
@@ -150,7 +150,7 @@
         <w:rPr>
           <w:sz w:val="24"/>
         </w:rPr>
-        <w:t>#3  西汉 · 终军请缨  [成语典故]</w:t>
+        <w:t>#3  战国 · 负荆请罪  [成语典故]</w:t>
       </w:r>
     </w:p>
     <w:p>
@@ -158,7 +158,7 @@
         <w:spacing w:line="336" w:lineRule="auto"/>
       </w:pPr>
       <w:r>
-        <w:t>💡 少年可立凌云志，勇挑重担，一腔热血报国，即使生命短暂，也足以千古流芳。</w:t>
+        <w:t>💡 真正的强者敢于承认错误。将相和则国家兴，个人恩怨在集体利益面前不值一提，谦让与自省是化解矛盾的最好武器。</w:t>
       </w:r>
     </w:p>
     <w:p/>
@@ -170,7 +170,7 @@
         <w:rPr>
           <w:sz w:val="24"/>
         </w:rPr>
-        <w:t>#4  唐朝 · 唾面自干  [成语典故]</w:t>
+        <w:t>#4  春秋 · 卧薪尝胆  [成语典故]</w:t>
       </w:r>
     </w:p>
     <w:p>
@@ -178,7 +178,7 @@
         <w:spacing w:line="336" w:lineRule="auto"/>
       </w:pPr>
       <w:r>
-        <w:t>💡 面对无端羞辱，最高级的应对有时是不屑一顾的从容，把精力留给真正重要的事。</w:t>
+        <w:t>💡 苦难是最好的磨刀石。在逆境中若能守住志气、隐忍蓄力，终能化悲愤为力量，实现绝地反击。</w:t>
       </w:r>
     </w:p>
     <w:p/>
@@ -190,7 +190,7 @@
         <w:rPr>
           <w:sz w:val="24"/>
         </w:rPr>
-        <w:t>#5  南北朝 · 寄人篱下  [成语典故]</w:t>
+        <w:t>#5  战国 · 余音绕梁  [成语典故]</w:t>
       </w:r>
     </w:p>
     <w:p>
@@ -198,7 +198,7 @@
         <w:spacing w:line="336" w:lineRule="auto"/>
       </w:pPr>
       <w:r>
-        <w:t>💡 做学问和事业都要有独立精神，一味模仿终究缺乏生命力，创新才能脱颖而出。</w:t>
+        <w:t>💡 真正动人的艺术能穿透时空。用心创作、投入真情，作品才能拥有持久的生命力，在人们心间久久回响。</w:t>
       </w:r>
     </w:p>
     <w:p/>
@@ -210,7 +210,7 @@
         <w:rPr>
           <w:sz w:val="24"/>
         </w:rPr>
-        <w:t>#6  南北朝 · 百万买宅，千万买邻  [成语典故]</w:t>
+        <w:t>#6  北宋 · 程门立雪  [成语典故]</w:t>
       </w:r>
     </w:p>
     <w:p>
@@ -218,7 +218,7 @@
         <w:spacing w:line="336" w:lineRule="auto"/>
       </w:pPr>
       <w:r>
-        <w:t>💡 千金买屋，万金买邻，良好的人际环境和品德高尚的邻居，远比物质本身更有价值。</w:t>
+        <w:t>💡 求学问需有敬意和耐心。真正的师道尊严源自学生发自内心的虔诚，静待一时雪，赢得终身学。</w:t>
       </w:r>
     </w:p>
     <w:p/>
@@ -230,7 +230,7 @@
         <w:rPr>
           <w:sz w:val="24"/>
         </w:rPr>
-        <w:t>#7  战国 · 庖丁解牛  [诸子百家寓言]</w:t>
+        <w:t>#7  战国 · 一字千金  [成语典故]</w:t>
       </w:r>
     </w:p>
     <w:p>
@@ -238,7 +238,7 @@
         <w:spacing w:line="336" w:lineRule="auto"/>
       </w:pPr>
       <w:r>
-        <w:t>💡 顺应自然规律善于避实就虚，就能在复杂环境中游刃有余，保全自身。</w:t>
+        <w:t>💡 真正的价值经得起检验。敢于放话“一字千金”，背后是精益求精的打磨，任何作品唯有追求极致才可能站得住脚。</w:t>
       </w:r>
     </w:p>
     <w:p/>
@@ -250,7 +250,7 @@
         <w:rPr>
           <w:sz w:val="24"/>
         </w:rPr>
-        <w:t>#8  战国 · 纪昌学射  [诸子百家寓言]</w:t>
+        <w:t>#8  东汉 · 蔡伦改进造纸术  [古代科技发明故事]</w:t>
       </w:r>
     </w:p>
     <w:p>
@@ -258,7 +258,7 @@
         <w:spacing w:line="336" w:lineRule="auto"/>
       </w:pPr>
       <w:r>
-        <w:t>💡 最高技能来自于极致的基本功训练和专注，下足笨功夫，才能出神入化。</w:t>
+        <w:t>💡 改变世界的发明往往源于对日常不便的观察。蔡伦用废弃物创造文明载体，说明创新不一定要高不可攀，重组旧元素也能产生奇迹。</w:t>
       </w:r>
     </w:p>
     <w:p/>
@@ -270,7 +270,7 @@
         <w:rPr>
           <w:sz w:val="24"/>
         </w:rPr>
-        <w:t>#9  三国 · 木牛流马：诸葛亮的运粮黑科技  [古代科技发明故事]</w:t>
+        <w:t>#9  东汉 · 杜诗发明水排  [古代科技发明故事]</w:t>
       </w:r>
     </w:p>
     <w:p>
@@ -278,7 +278,7 @@
         <w:spacing w:line="336" w:lineRule="auto"/>
       </w:pPr>
       <w:r>
-        <w:t>💡 技术创新能弥补资源短板，而照搬技术若不通原理，终究东施效颦。</w:t>
+        <w:t>💡 善用自然之力是智慧的最高境界。杜诗没有增加人力，而是借助水流，用巧思放大能量，启示我们解决问题要善借外力。</w:t>
       </w:r>
     </w:p>
     <w:p/>
@@ -290,7 +290,7 @@
         <w:rPr>
           <w:sz w:val="24"/>
         </w:rPr>
-        <w:t>#10  元朝 · 黄道婆改革棉纺技术  [古代科技发明故事]</w:t>
+        <w:t>#10  战国 · 庖丁解牛  [诸子百家寓言]</w:t>
       </w:r>
     </w:p>
     <w:p>
@@ -298,7 +298,7 @@
         <w:spacing w:line="336" w:lineRule="auto"/>
       </w:pPr>
       <w:r>
-        <w:t>💡 把异地的先进技术因地制宜地改造推广，一位普通劳动者也能推动一个产业革命。</w:t>
+        <w:t>💡 掌握规律比蛮干更重要。解牛如此，处世亦然——看清事物的肌理结构，找到间隙而行，便能省力且长久。</w:t>
       </w:r>
     </w:p>
     <w:p/>

</xml_diff>